<commit_message>
fix: fix lua filter for pdf and update docx references
test references updated as well
</commit_message>
<xml_diff>
--- a/app/reference_docs/reference_a4.docx
+++ b/app/reference_docs/reference_a4.docx
@@ -11131,6 +11131,30 @@
       <w:shd w:val="clear" w:color="auto" w:fill="3D1466"/>
     </w:rPr>
   </w:style>
+  <w:style w:type="paragraph" w:customStyle="1" w:styleId="align-center">
+    <w:name w:val="align-center"/>
+    <w:basedOn w:val="Normal"/>
+    <w:semiHidden/>
+    <w:pPr>
+      <w:jc w:val="center"/>
+    </w:pPr>
+  </w:style>
+  <w:style w:type="paragraph" w:customStyle="1" w:styleId="align-right">
+    <w:name w:val="align-right"/>
+    <w:basedOn w:val="Normal"/>
+    <w:semiHidden/>
+    <w:pPr>
+      <w:jc w:val="right"/>
+    </w:pPr>
+  </w:style>
+  <w:style w:type="paragraph" w:customStyle="1" w:styleId="align-justify">
+    <w:name w:val="align-justify"/>
+    <w:basedOn w:val="Normal"/>
+    <w:semiHidden/>
+    <w:pPr>
+      <w:jc w:val="both"/>
+    </w:pPr>
+  </w:style>
 </w:styles>
 </file>
 

</xml_diff>